<commit_message>
Restart and select cell ready
</commit_message>
<xml_diff>
--- a/CheckList.docx
+++ b/CheckList.docx
@@ -894,16 +894,6 @@
           <w:highlight w:val="green"/>
           <w:lang w:eastAsia="ru-RU"/>
         </w:rPr>
-        <w:t xml:space="preserve"> и</w:t>
-      </w:r>
-      <w:r>
-        <w:rPr>
-          <w:rFonts w:ascii="Arial" w:eastAsia="Times New Roman" w:hAnsi="Arial" w:cs="Arial"/>
-          <w:color w:val="000000"/>
-          <w:sz w:val="27"/>
-          <w:szCs w:val="27"/>
-          <w:lang w:eastAsia="ru-RU"/>
-        </w:rPr>
         <w:t xml:space="preserve"> </w:t>
       </w:r>
       <w:r>
@@ -912,10 +902,10 @@
           <w:color w:val="000000"/>
           <w:sz w:val="27"/>
           <w:szCs w:val="27"/>
-          <w:highlight w:val="cyan"/>
-          <w:lang w:eastAsia="ru-RU"/>
-        </w:rPr>
-        <w:t xml:space="preserve">выключить </w:t>
+          <w:highlight w:val="green"/>
+          <w:lang w:eastAsia="ru-RU"/>
+        </w:rPr>
+        <w:t xml:space="preserve">и выключить </w:t>
       </w:r>
       <w:proofErr w:type="spellStart"/>
       <w:r>
@@ -924,7 +914,7 @@
           <w:color w:val="000000"/>
           <w:sz w:val="27"/>
           <w:szCs w:val="27"/>
-          <w:highlight w:val="cyan"/>
+          <w:highlight w:val="green"/>
           <w:lang w:eastAsia="ru-RU"/>
         </w:rPr>
         <w:t>MeshRenderer</w:t>
@@ -936,7 +926,7 @@
           <w:color w:val="000000"/>
           <w:sz w:val="27"/>
           <w:szCs w:val="27"/>
-          <w:highlight w:val="cyan"/>
+          <w:highlight w:val="green"/>
           <w:lang w:eastAsia="ru-RU"/>
         </w:rPr>
         <w:t xml:space="preserve"> компонент</w:t>
@@ -1257,15 +1247,17 @@
           <w:color w:val="000000"/>
           <w:sz w:val="27"/>
           <w:szCs w:val="27"/>
-          <w:lang w:eastAsia="ru-RU"/>
-        </w:rPr>
-      </w:pPr>
-      <w:r>
-        <w:rPr>
-          <w:rFonts w:ascii="Arial" w:eastAsia="Times New Roman" w:hAnsi="Arial" w:cs="Arial"/>
-          <w:color w:val="000000"/>
-          <w:sz w:val="27"/>
-          <w:szCs w:val="27"/>
+          <w:highlight w:val="green"/>
+          <w:lang w:eastAsia="ru-RU"/>
+        </w:rPr>
+      </w:pPr>
+      <w:r>
+        <w:rPr>
+          <w:rFonts w:ascii="Arial" w:eastAsia="Times New Roman" w:hAnsi="Arial" w:cs="Arial"/>
+          <w:color w:val="000000"/>
+          <w:sz w:val="27"/>
+          <w:szCs w:val="27"/>
+          <w:highlight w:val="green"/>
           <w:lang w:eastAsia="ru-RU"/>
         </w:rPr>
         <w:t xml:space="preserve">Для настройки Select нужно реализовать два метода: </w:t>
@@ -1277,6 +1269,7 @@
           <w:color w:val="000000"/>
           <w:sz w:val="27"/>
           <w:szCs w:val="27"/>
+          <w:highlight w:val="green"/>
           <w:lang w:eastAsia="ru-RU"/>
         </w:rPr>
         <w:t>SetSelect</w:t>
@@ -1288,6 +1281,7 @@
           <w:color w:val="000000"/>
           <w:sz w:val="27"/>
           <w:szCs w:val="27"/>
+          <w:highlight w:val="green"/>
           <w:lang w:eastAsia="ru-RU"/>
         </w:rPr>
         <w:t xml:space="preserve"> и </w:t>
@@ -1299,6 +1293,7 @@
           <w:color w:val="000000"/>
           <w:sz w:val="27"/>
           <w:szCs w:val="27"/>
+          <w:highlight w:val="green"/>
           <w:lang w:eastAsia="ru-RU"/>
         </w:rPr>
         <w:t>ResetSelect</w:t>
@@ -1310,6 +1305,7 @@
           <w:color w:val="000000"/>
           <w:sz w:val="27"/>
           <w:szCs w:val="27"/>
+          <w:highlight w:val="green"/>
           <w:lang w:eastAsia="ru-RU"/>
         </w:rPr>
         <w:t>, в первом включать меш Select и задавать материал, полученный в аргументе, во втором - выключать меш Select</w:t>
@@ -1745,17 +1741,7 @@
           <w:highlight w:val="green"/>
           <w:lang w:eastAsia="ru-RU"/>
         </w:rPr>
-        <w:t>,</w:t>
-      </w:r>
-      <w:r>
-        <w:rPr>
-          <w:rFonts w:ascii="Arial" w:eastAsia="Times New Roman" w:hAnsi="Arial" w:cs="Arial"/>
-          <w:color w:val="000000"/>
-          <w:sz w:val="27"/>
-          <w:szCs w:val="27"/>
-          <w:lang w:eastAsia="ru-RU"/>
-        </w:rPr>
-        <w:t xml:space="preserve"> прокидывать в контейнер его карты </w:t>
+        <w:t xml:space="preserve">, прокидывать в контейнер его карты </w:t>
       </w:r>
       <w:proofErr w:type="spellStart"/>
       <w:r>
@@ -1764,6 +1750,7 @@
           <w:color w:val="000000"/>
           <w:sz w:val="27"/>
           <w:szCs w:val="27"/>
+          <w:highlight w:val="green"/>
           <w:lang w:eastAsia="ru-RU"/>
         </w:rPr>
         <w:t>экшенов</w:t>
@@ -1832,15 +1819,17 @@
           <w:color w:val="000000"/>
           <w:sz w:val="27"/>
           <w:szCs w:val="27"/>
-          <w:lang w:eastAsia="ru-RU"/>
-        </w:rPr>
-      </w:pPr>
-      <w:r>
-        <w:rPr>
-          <w:rFonts w:ascii="Arial" w:eastAsia="Times New Roman" w:hAnsi="Arial" w:cs="Arial"/>
-          <w:color w:val="000000"/>
-          <w:sz w:val="27"/>
-          <w:szCs w:val="27"/>
+          <w:highlight w:val="green"/>
+          <w:lang w:eastAsia="ru-RU"/>
+        </w:rPr>
+      </w:pPr>
+      <w:r>
+        <w:rPr>
+          <w:rFonts w:ascii="Arial" w:eastAsia="Times New Roman" w:hAnsi="Arial" w:cs="Arial"/>
+          <w:color w:val="000000"/>
+          <w:sz w:val="27"/>
+          <w:szCs w:val="27"/>
+          <w:highlight w:val="green"/>
           <w:lang w:eastAsia="ru-RU"/>
         </w:rPr>
         <w:t xml:space="preserve">При вводе </w:t>
@@ -1852,6 +1841,7 @@
           <w:color w:val="000000"/>
           <w:sz w:val="27"/>
           <w:szCs w:val="27"/>
+          <w:highlight w:val="green"/>
           <w:lang w:eastAsia="ru-RU"/>
         </w:rPr>
         <w:t>Restart</w:t>
@@ -1863,6 +1853,7 @@
           <w:color w:val="000000"/>
           <w:sz w:val="27"/>
           <w:szCs w:val="27"/>
+          <w:highlight w:val="green"/>
           <w:lang w:eastAsia="ru-RU"/>
         </w:rPr>
         <w:t xml:space="preserve"> </w:t>
@@ -1874,6 +1865,7 @@
           <w:color w:val="000000"/>
           <w:sz w:val="27"/>
           <w:szCs w:val="27"/>
+          <w:highlight w:val="green"/>
           <w:lang w:eastAsia="ru-RU"/>
         </w:rPr>
         <w:t>инпута</w:t>
@@ -1885,6 +1877,7 @@
           <w:color w:val="000000"/>
           <w:sz w:val="27"/>
           <w:szCs w:val="27"/>
+          <w:highlight w:val="green"/>
           <w:lang w:eastAsia="ru-RU"/>
         </w:rPr>
         <w:t xml:space="preserve">, на экране появляется шкала </w:t>
@@ -1896,6 +1889,7 @@
           <w:color w:val="000000"/>
           <w:sz w:val="27"/>
           <w:szCs w:val="27"/>
+          <w:highlight w:val="green"/>
           <w:lang w:eastAsia="ru-RU"/>
         </w:rPr>
         <w:t>Restart</w:t>
@@ -1907,6 +1901,7 @@
           <w:color w:val="000000"/>
           <w:sz w:val="27"/>
           <w:szCs w:val="27"/>
+          <w:highlight w:val="green"/>
           <w:lang w:eastAsia="ru-RU"/>
         </w:rPr>
         <w:t xml:space="preserve"> и начинает заполняться</w:t>
@@ -1925,15 +1920,17 @@
           <w:color w:val="000000"/>
           <w:sz w:val="27"/>
           <w:szCs w:val="27"/>
-          <w:lang w:eastAsia="ru-RU"/>
-        </w:rPr>
-      </w:pPr>
-      <w:r>
-        <w:rPr>
-          <w:rFonts w:ascii="Arial" w:eastAsia="Times New Roman" w:hAnsi="Arial" w:cs="Arial"/>
-          <w:color w:val="000000"/>
-          <w:sz w:val="27"/>
-          <w:szCs w:val="27"/>
+          <w:highlight w:val="green"/>
+          <w:lang w:eastAsia="ru-RU"/>
+        </w:rPr>
+      </w:pPr>
+      <w:r>
+        <w:rPr>
+          <w:rFonts w:ascii="Arial" w:eastAsia="Times New Roman" w:hAnsi="Arial" w:cs="Arial"/>
+          <w:color w:val="000000"/>
+          <w:sz w:val="27"/>
+          <w:szCs w:val="27"/>
+          <w:highlight w:val="green"/>
           <w:lang w:eastAsia="ru-RU"/>
         </w:rPr>
         <w:t xml:space="preserve">Если ввод </w:t>
@@ -1945,6 +1942,7 @@
           <w:color w:val="000000"/>
           <w:sz w:val="27"/>
           <w:szCs w:val="27"/>
+          <w:highlight w:val="green"/>
           <w:lang w:eastAsia="ru-RU"/>
         </w:rPr>
         <w:t>инпута</w:t>
@@ -1956,6 +1954,7 @@
           <w:color w:val="000000"/>
           <w:sz w:val="27"/>
           <w:szCs w:val="27"/>
+          <w:highlight w:val="green"/>
           <w:lang w:eastAsia="ru-RU"/>
         </w:rPr>
         <w:t xml:space="preserve"> прекратился - шкала выключается</w:t>
@@ -1974,15 +1973,17 @@
           <w:color w:val="000000"/>
           <w:sz w:val="27"/>
           <w:szCs w:val="27"/>
-          <w:lang w:eastAsia="ru-RU"/>
-        </w:rPr>
-      </w:pPr>
-      <w:r>
-        <w:rPr>
-          <w:rFonts w:ascii="Arial" w:eastAsia="Times New Roman" w:hAnsi="Arial" w:cs="Arial"/>
-          <w:color w:val="000000"/>
-          <w:sz w:val="27"/>
-          <w:szCs w:val="27"/>
+          <w:highlight w:val="green"/>
+          <w:lang w:eastAsia="ru-RU"/>
+        </w:rPr>
+      </w:pPr>
+      <w:r>
+        <w:rPr>
+          <w:rFonts w:ascii="Arial" w:eastAsia="Times New Roman" w:hAnsi="Arial" w:cs="Arial"/>
+          <w:color w:val="000000"/>
+          <w:sz w:val="27"/>
+          <w:szCs w:val="27"/>
+          <w:highlight w:val="green"/>
           <w:lang w:eastAsia="ru-RU"/>
         </w:rPr>
         <w:t xml:space="preserve">Если ввод </w:t>
@@ -1994,6 +1995,7 @@
           <w:color w:val="000000"/>
           <w:sz w:val="27"/>
           <w:szCs w:val="27"/>
+          <w:highlight w:val="green"/>
           <w:lang w:eastAsia="ru-RU"/>
         </w:rPr>
         <w:t>инпута</w:t>
@@ -2005,6 +2007,7 @@
           <w:color w:val="000000"/>
           <w:sz w:val="27"/>
           <w:szCs w:val="27"/>
+          <w:highlight w:val="green"/>
           <w:lang w:eastAsia="ru-RU"/>
         </w:rPr>
         <w:t xml:space="preserve"> </w:t>
@@ -2016,6 +2019,7 @@
           <w:color w:val="000000"/>
           <w:sz w:val="27"/>
           <w:szCs w:val="27"/>
+          <w:highlight w:val="green"/>
           <w:lang w:eastAsia="ru-RU"/>
         </w:rPr>
         <w:t>закончился</w:t>
@@ -2027,6 +2031,7 @@
           <w:color w:val="000000"/>
           <w:sz w:val="27"/>
           <w:szCs w:val="27"/>
+          <w:highlight w:val="green"/>
           <w:lang w:eastAsia="ru-RU"/>
         </w:rPr>
         <w:t xml:space="preserve"> и шкала заполнилась - происходит перезагрузка сцены</w:t>
@@ -5198,6 +5203,74 @@
       <w:bCs/>
     </w:rPr>
   </w:style>
+  <w:style w:type="character" w:styleId="a5">
+    <w:name w:val="annotation reference"/>
+    <w:basedOn w:val="a0"/>
+    <w:uiPriority w:val="99"/>
+    <w:semiHidden/>
+    <w:unhideWhenUsed/>
+    <w:rsid w:val="00F141FF"/>
+    <w:rPr>
+      <w:sz w:val="16"/>
+      <w:szCs w:val="16"/>
+    </w:rPr>
+  </w:style>
+  <w:style w:type="paragraph" w:styleId="a6">
+    <w:name w:val="annotation text"/>
+    <w:basedOn w:val="a"/>
+    <w:link w:val="a7"/>
+    <w:uiPriority w:val="99"/>
+    <w:semiHidden/>
+    <w:unhideWhenUsed/>
+    <w:rsid w:val="00F141FF"/>
+    <w:pPr>
+      <w:spacing w:line="240" w:lineRule="auto"/>
+    </w:pPr>
+    <w:rPr>
+      <w:sz w:val="20"/>
+      <w:szCs w:val="20"/>
+    </w:rPr>
+  </w:style>
+  <w:style w:type="character" w:customStyle="1" w:styleId="a7">
+    <w:name w:val="Текст примечания Знак"/>
+    <w:basedOn w:val="a0"/>
+    <w:link w:val="a6"/>
+    <w:uiPriority w:val="99"/>
+    <w:semiHidden/>
+    <w:rsid w:val="00F141FF"/>
+    <w:rPr>
+      <w:sz w:val="20"/>
+      <w:szCs w:val="20"/>
+    </w:rPr>
+  </w:style>
+  <w:style w:type="paragraph" w:styleId="a8">
+    <w:name w:val="annotation subject"/>
+    <w:basedOn w:val="a6"/>
+    <w:next w:val="a6"/>
+    <w:link w:val="a9"/>
+    <w:uiPriority w:val="99"/>
+    <w:semiHidden/>
+    <w:unhideWhenUsed/>
+    <w:rsid w:val="00F141FF"/>
+    <w:rPr>
+      <w:b/>
+      <w:bCs/>
+    </w:rPr>
+  </w:style>
+  <w:style w:type="character" w:customStyle="1" w:styleId="a9">
+    <w:name w:val="Тема примечания Знак"/>
+    <w:basedOn w:val="a7"/>
+    <w:link w:val="a8"/>
+    <w:uiPriority w:val="99"/>
+    <w:semiHidden/>
+    <w:rsid w:val="00F141FF"/>
+    <w:rPr>
+      <w:b/>
+      <w:bCs/>
+      <w:sz w:val="20"/>
+      <w:szCs w:val="20"/>
+    </w:rPr>
+  </w:style>
 </w:styles>
 </file>
 

</xml_diff>